<commit_message>
highlight + all occurance of search covered (fixed)
</commit_message>
<xml_diff>
--- a/templates/2026_01_Precision_AI_UFA_Template1.docx
+++ b/templates/2026_01_Precision_AI_UFA_Template1.docx
@@ -439,9 +439,13 @@
       <w:bookmarkStart w:id="1" w:name="_Toc217745032"/>
       <w:r>
         <w:rPr/>
-        <w:t>Executive Summary</w:t>
+        <w:t>Executive “Summary</w:t>
       </w:r>
       <w:bookmarkEnd w:id="1"/>
+      <w:r>
+        <w:rPr/>
+        <w:t>”</w:t>
+      </w:r>
     </w:p>
     <w:p>
       <w:pPr>
@@ -503,7 +507,7 @@
       </w:r>
       <w:r>
         <w:rPr>
-          <w:rFonts w:asciiTheme="minorHAnsi" w:cstheme="minorBidi" w:eastAsiaTheme="minorEastAsia" w:hAnsiTheme="minorHAnsi"/>
+          <w:rFonts w:eastAsia="" w:cs="" w:cstheme="minorBidi" w:eastAsiaTheme="minorEastAsia"/>
           <w:shd w:fill="55215B" w:val="clear"/>
         </w:rPr>
         <w:t>was popularised</w:t>
@@ -914,15 +918,15 @@
           <wp:effectExtent l="0" t="0" r="0" b="0"/>
           <wp:wrapThrough wrapText="bothSides">
             <wp:wrapPolygon edited="0">
-              <wp:start x="-58" y="0"/>
-              <wp:lineTo x="-58" y="9760"/>
-              <wp:lineTo x="5022" y="12025"/>
-              <wp:lineTo x="7572" y="21075"/>
-              <wp:lineTo x="13498" y="21075"/>
-              <wp:lineTo x="16039" y="12025"/>
-              <wp:lineTo x="21119" y="9760"/>
-              <wp:lineTo x="21119" y="0"/>
-              <wp:lineTo x="-58" y="0"/>
+              <wp:start x="-68" y="0"/>
+              <wp:lineTo x="-68" y="9752"/>
+              <wp:lineTo x="5013" y="12017"/>
+              <wp:lineTo x="7561" y="21067"/>
+              <wp:lineTo x="13489" y="21067"/>
+              <wp:lineTo x="16030" y="12017"/>
+              <wp:lineTo x="21110" y="9752"/>
+              <wp:lineTo x="21110" y="0"/>
+              <wp:lineTo x="-68" y="0"/>
             </wp:wrapPolygon>
           </wp:wrapThrough>
           <wp:docPr id="2" name="Picture 18" descr=""/>
@@ -1042,9 +1046,9 @@
           <wp:wrapThrough wrapText="bothSides">
             <wp:wrapPolygon edited="0">
               <wp:start x="-7" y="0"/>
-              <wp:lineTo x="-7" y="21241"/>
-              <wp:lineTo x="21247" y="21241"/>
-              <wp:lineTo x="21247" y="0"/>
+              <wp:lineTo x="-7" y="21233"/>
+              <wp:lineTo x="21239" y="21233"/>
+              <wp:lineTo x="21239" y="0"/>
               <wp:lineTo x="-7" y="0"/>
             </wp:wrapPolygon>
           </wp:wrapThrough>
@@ -1265,7 +1269,7 @@
         <w:docPartGallery w:val="Page Numbers (Top of Page)"/>
         <w:docPartUnique w:val="true"/>
       </w:docPartObj>
-      <w:id w:val="408720716"/>
+      <w:id w:val="1811673420"/>
     </w:sdtPr>
     <w:sdtContent>
       <w:p>
@@ -1383,8 +1387,8 @@
                       <wps:cNvSpPr/>
                       <wps:spPr>
                         <a:xfrm>
-                          <a:off x="2212200" y="125640"/>
-                          <a:ext cx="30600" cy="149400"/>
+                          <a:off x="2212920" y="125640"/>
+                          <a:ext cx="29880" cy="149400"/>
                         </a:xfrm>
                         <a:custGeom>
                           <a:avLst/>
@@ -1433,7 +1437,7 @@
                       <wps:spPr>
                         <a:xfrm>
                           <a:off x="528840" y="125640"/>
-                          <a:ext cx="54000" cy="148680"/>
+                          <a:ext cx="53280" cy="148680"/>
                         </a:xfrm>
                         <a:custGeom>
                           <a:avLst/>
@@ -1504,7 +1508,7 @@
                       <wps:spPr>
                         <a:xfrm>
                           <a:off x="586800" y="125640"/>
-                          <a:ext cx="54000" cy="101520"/>
+                          <a:ext cx="53280" cy="101520"/>
                         </a:xfrm>
                         <a:custGeom>
                           <a:avLst/>
@@ -1590,7 +1594,7 @@
                       <wps:spPr>
                         <a:xfrm>
                           <a:off x="699120" y="125640"/>
-                          <a:ext cx="54000" cy="148680"/>
+                          <a:ext cx="53280" cy="148680"/>
                         </a:xfrm>
                         <a:custGeom>
                           <a:avLst/>
@@ -1661,7 +1665,7 @@
                       <wps:spPr>
                         <a:xfrm>
                           <a:off x="757440" y="125640"/>
-                          <a:ext cx="60480" cy="148680"/>
+                          <a:ext cx="59760" cy="148680"/>
                         </a:xfrm>
                         <a:custGeom>
                           <a:avLst/>
@@ -1743,7 +1747,7 @@
                       <wps:spPr>
                         <a:xfrm>
                           <a:off x="877680" y="125640"/>
-                          <a:ext cx="103680" cy="148680"/>
+                          <a:ext cx="102960" cy="148680"/>
                         </a:xfrm>
                         <a:custGeom>
                           <a:avLst/>
@@ -1925,8 +1929,8 @@
                       <wps:cNvSpPr/>
                       <wps:spPr>
                         <a:xfrm>
-                          <a:off x="1230120" y="125640"/>
-                          <a:ext cx="34200" cy="148680"/>
+                          <a:off x="1230480" y="125640"/>
+                          <a:ext cx="33480" cy="148680"/>
                         </a:xfrm>
                         <a:custGeom>
                           <a:avLst/>
@@ -1974,8 +1978,8 @@
                       <wps:cNvSpPr/>
                       <wps:spPr>
                         <a:xfrm>
-                          <a:off x="1322640" y="123840"/>
-                          <a:ext cx="115560" cy="153000"/>
+                          <a:off x="1323360" y="123840"/>
+                          <a:ext cx="114840" cy="153000"/>
                         </a:xfrm>
                         <a:custGeom>
                           <a:avLst/>
@@ -2104,8 +2108,8 @@
                       <wps:cNvSpPr/>
                       <wps:spPr>
                         <a:xfrm>
-                          <a:off x="1492920" y="125640"/>
-                          <a:ext cx="33120" cy="148680"/>
+                          <a:off x="1493640" y="125640"/>
+                          <a:ext cx="32400" cy="148680"/>
                         </a:xfrm>
                         <a:custGeom>
                           <a:avLst/>
@@ -2153,8 +2157,8 @@
                       <wps:cNvSpPr/>
                       <wps:spPr>
                         <a:xfrm>
-                          <a:off x="1589400" y="122400"/>
-                          <a:ext cx="73800" cy="153000"/>
+                          <a:off x="1590120" y="122400"/>
+                          <a:ext cx="73080" cy="153000"/>
                         </a:xfrm>
                         <a:custGeom>
                           <a:avLst/>
@@ -2249,8 +2253,8 @@
                       <wps:cNvSpPr/>
                       <wps:spPr>
                         <a:xfrm>
-                          <a:off x="1666800" y="123120"/>
-                          <a:ext cx="73800" cy="153000"/>
+                          <a:off x="1667520" y="123120"/>
+                          <a:ext cx="73080" cy="153000"/>
                         </a:xfrm>
                         <a:custGeom>
                           <a:avLst/>
@@ -2345,8 +2349,8 @@
                       <wps:cNvSpPr/>
                       <wps:spPr>
                         <a:xfrm>
-                          <a:off x="1788120" y="125640"/>
-                          <a:ext cx="128880" cy="148680"/>
+                          <a:off x="1788840" y="125640"/>
+                          <a:ext cx="128160" cy="148680"/>
                         </a:xfrm>
                         <a:custGeom>
                           <a:avLst/>
@@ -2413,8 +2417,8 @@
                       <wps:cNvSpPr/>
                       <wps:spPr>
                         <a:xfrm>
-                          <a:off x="2033280" y="125640"/>
-                          <a:ext cx="68040" cy="148680"/>
+                          <a:off x="2034000" y="125640"/>
+                          <a:ext cx="67320" cy="148680"/>
                         </a:xfrm>
                         <a:custGeom>
                           <a:avLst/>
@@ -2478,8 +2482,8 @@
                       <wps:cNvSpPr/>
                       <wps:spPr>
                         <a:xfrm>
-                          <a:off x="2104560" y="125640"/>
-                          <a:ext cx="66600" cy="148680"/>
+                          <a:off x="2104920" y="125640"/>
+                          <a:ext cx="65880" cy="148680"/>
                         </a:xfrm>
                         <a:custGeom>
                           <a:avLst/>
@@ -2547,7 +2551,7 @@
                       <wps:spPr>
                         <a:xfrm>
                           <a:off x="0" y="0"/>
-                          <a:ext cx="392400" cy="364320"/>
+                          <a:ext cx="391680" cy="364320"/>
                         </a:xfrm>
                         <a:custGeom>
                           <a:avLst/>

</xml_diff>